<commit_message>
he añadido git diff
</commit_message>
<xml_diff>
--- a/Repaso GITHUB.docx
+++ b/Repaso GITHUB.docx
@@ -631,6 +631,38 @@
       <w:proofErr w:type="spellEnd"/>
       <w:r>
         <w:t xml:space="preserve"> que hayamos realizado y en que rama estamos  </w:t>
+      </w:r>
+    </w:p>
+    <w:p>
+      <w:pPr>
+        <w:pStyle w:val="Sinespaciado"/>
+      </w:pPr>
+    </w:p>
+    <w:p>
+      <w:pPr>
+        <w:pStyle w:val="Sinespaciado"/>
+      </w:pPr>
+      <w:proofErr w:type="spellStart"/>
+      <w:r>
+        <w:t>Git</w:t>
+      </w:r>
+      <w:proofErr w:type="spellEnd"/>
+      <w:r>
+        <w:t xml:space="preserve"> </w:t>
+      </w:r>
+      <w:proofErr w:type="spellStart"/>
+      <w:r>
+        <w:t>diff</w:t>
+      </w:r>
+      <w:proofErr w:type="spellEnd"/>
+      <w:r>
+        <w:t xml:space="preserve"> </w:t>
+      </w:r>
+      <w:r>
+        <w:sym w:font="Wingdings" w:char="F0E0"/>
+      </w:r>
+      <w:r>
+        <w:t xml:space="preserve"> Muestra las cosas que se han cambiado de manera visual</w:t>
       </w:r>
     </w:p>
     <w:sectPr>

</xml_diff>

<commit_message>
He añadido el archivo de repaso GItHUB x2
</commit_message>
<xml_diff>
--- a/Repaso GITHUB.docx
+++ b/Repaso GITHUB.docx
@@ -913,7 +913,20 @@
         <w:t xml:space="preserve"> </w:t>
       </w:r>
       <w:r>
-        <w:t xml:space="preserve">Ayuda por la web sobre el comando que pedimos ayuda. </w:t>
+        <w:rPr>
+          <w:b/>
+          <w:sz w:val="28"/>
+        </w:rPr>
+        <w:t>Ayuda</w:t>
+      </w:r>
+      <w:r>
+        <w:rPr>
+          <w:sz w:val="28"/>
+        </w:rPr>
+        <w:t xml:space="preserve"> </w:t>
+      </w:r>
+      <w:r>
+        <w:t xml:space="preserve">por la web sobre el comando que pedimos ayuda. </w:t>
       </w:r>
     </w:p>
     <w:p>
@@ -1065,7 +1078,20 @@
         <w:t xml:space="preserve"> </w:t>
       </w:r>
       <w:r>
-        <w:t xml:space="preserve">Subir o sincronizar el </w:t>
+        <w:rPr>
+          <w:b/>
+          <w:sz w:val="28"/>
+        </w:rPr>
+        <w:t>Subir o sincronizar</w:t>
+      </w:r>
+      <w:r>
+        <w:rPr>
+          <w:sz w:val="28"/>
+        </w:rPr>
+        <w:t xml:space="preserve"> </w:t>
+      </w:r>
+      <w:r>
+        <w:t xml:space="preserve">el </w:t>
       </w:r>
       <w:proofErr w:type="spellStart"/>
       <w:r>
@@ -1098,41 +1124,105 @@
       </w:pPr>
       <w:proofErr w:type="spellStart"/>
       <w:r>
+        <w:rPr>
+          <w:b/>
+          <w:color w:val="0070C0"/>
+          <w:sz w:val="28"/>
+        </w:rPr>
         <w:t>Git</w:t>
       </w:r>
       <w:proofErr w:type="spellEnd"/>
       <w:r>
-        <w:t xml:space="preserve"> </w:t>
-      </w:r>
-      <w:proofErr w:type="spellStart"/>
-      <w:r>
+        <w:rPr>
+          <w:b/>
+          <w:color w:val="0070C0"/>
+          <w:sz w:val="28"/>
+        </w:rPr>
+        <w:t xml:space="preserve"> </w:t>
+      </w:r>
+      <w:proofErr w:type="spellStart"/>
+      <w:r>
+        <w:rPr>
+          <w:b/>
+          <w:color w:val="0070C0"/>
+          <w:sz w:val="28"/>
+        </w:rPr>
         <w:t>push</w:t>
       </w:r>
       <w:proofErr w:type="spellEnd"/>
       <w:r>
-        <w:t xml:space="preserve"> </w:t>
-      </w:r>
-      <w:proofErr w:type="spellStart"/>
-      <w:r>
+        <w:rPr>
+          <w:b/>
+          <w:color w:val="0070C0"/>
+          <w:sz w:val="28"/>
+        </w:rPr>
+        <w:t xml:space="preserve"> </w:t>
+      </w:r>
+      <w:proofErr w:type="spellStart"/>
+      <w:r>
+        <w:rPr>
+          <w:b/>
+          <w:color w:val="0070C0"/>
+          <w:sz w:val="28"/>
+        </w:rPr>
         <w:t>origin</w:t>
       </w:r>
       <w:proofErr w:type="spellEnd"/>
       <w:r>
-        <w:t xml:space="preserve"> </w:t>
-      </w:r>
-      <w:proofErr w:type="spellStart"/>
-      <w:r>
+        <w:rPr>
+          <w:b/>
+          <w:color w:val="0070C0"/>
+          <w:sz w:val="28"/>
+        </w:rPr>
+        <w:t xml:space="preserve"> </w:t>
+      </w:r>
+      <w:proofErr w:type="spellStart"/>
+      <w:r>
+        <w:rPr>
+          <w:b/>
+          <w:color w:val="0070C0"/>
+          <w:sz w:val="28"/>
+        </w:rPr>
         <w:t>main</w:t>
       </w:r>
       <w:proofErr w:type="spellEnd"/>
       <w:r>
-        <w:t xml:space="preserve"> </w:t>
-      </w:r>
-      <w:r>
+        <w:rPr>
+          <w:b/>
+          <w:color w:val="0070C0"/>
+          <w:sz w:val="28"/>
+        </w:rPr>
+        <w:t xml:space="preserve"> </w:t>
+      </w:r>
+      <w:r>
+        <w:rPr>
+          <w:b/>
+          <w:color w:val="0070C0"/>
+          <w:sz w:val="28"/>
+        </w:rPr>
         <w:sym w:font="Wingdings" w:char="F0E0"/>
       </w:r>
       <w:r>
-        <w:t xml:space="preserve"> Enviar los cambios locales a la rama </w:t>
+        <w:rPr>
+          <w:sz w:val="28"/>
+        </w:rPr>
+        <w:t xml:space="preserve"> </w:t>
+      </w:r>
+      <w:r>
+        <w:rPr>
+          <w:b/>
+          <w:sz w:val="28"/>
+        </w:rPr>
+        <w:t>Enviar</w:t>
+      </w:r>
+      <w:r>
+        <w:rPr>
+          <w:sz w:val="28"/>
+        </w:rPr>
+        <w:t xml:space="preserve"> </w:t>
+      </w:r>
+      <w:r>
+        <w:t xml:space="preserve">los cambios locales a la rama </w:t>
       </w:r>
       <w:proofErr w:type="spellStart"/>
       <w:r>
@@ -1157,41 +1247,105 @@
       </w:pPr>
       <w:proofErr w:type="spellStart"/>
       <w:r>
+        <w:rPr>
+          <w:b/>
+          <w:color w:val="0070C0"/>
+          <w:sz w:val="28"/>
+        </w:rPr>
         <w:t>Git</w:t>
       </w:r>
       <w:proofErr w:type="spellEnd"/>
       <w:r>
-        <w:t xml:space="preserve"> </w:t>
-      </w:r>
-      <w:proofErr w:type="spellStart"/>
-      <w:r>
+        <w:rPr>
+          <w:b/>
+          <w:color w:val="0070C0"/>
+          <w:sz w:val="28"/>
+        </w:rPr>
+        <w:t xml:space="preserve"> </w:t>
+      </w:r>
+      <w:proofErr w:type="spellStart"/>
+      <w:r>
+        <w:rPr>
+          <w:b/>
+          <w:color w:val="0070C0"/>
+          <w:sz w:val="28"/>
+        </w:rPr>
         <w:t>pull</w:t>
       </w:r>
       <w:proofErr w:type="spellEnd"/>
       <w:r>
-        <w:t xml:space="preserve"> </w:t>
-      </w:r>
-      <w:proofErr w:type="spellStart"/>
-      <w:r>
+        <w:rPr>
+          <w:b/>
+          <w:color w:val="0070C0"/>
+          <w:sz w:val="28"/>
+        </w:rPr>
+        <w:t xml:space="preserve"> </w:t>
+      </w:r>
+      <w:proofErr w:type="spellStart"/>
+      <w:r>
+        <w:rPr>
+          <w:b/>
+          <w:color w:val="0070C0"/>
+          <w:sz w:val="28"/>
+        </w:rPr>
         <w:t>origin</w:t>
       </w:r>
       <w:proofErr w:type="spellEnd"/>
       <w:r>
-        <w:t xml:space="preserve"> </w:t>
-      </w:r>
-      <w:proofErr w:type="spellStart"/>
-      <w:r>
+        <w:rPr>
+          <w:b/>
+          <w:color w:val="0070C0"/>
+          <w:sz w:val="28"/>
+        </w:rPr>
+        <w:t xml:space="preserve"> </w:t>
+      </w:r>
+      <w:proofErr w:type="spellStart"/>
+      <w:r>
+        <w:rPr>
+          <w:b/>
+          <w:color w:val="0070C0"/>
+          <w:sz w:val="28"/>
+        </w:rPr>
         <w:t>main</w:t>
       </w:r>
       <w:proofErr w:type="spellEnd"/>
       <w:r>
-        <w:t xml:space="preserve"> </w:t>
-      </w:r>
-      <w:r>
+        <w:rPr>
+          <w:b/>
+          <w:color w:val="0070C0"/>
+          <w:sz w:val="28"/>
+        </w:rPr>
+        <w:t xml:space="preserve"> </w:t>
+      </w:r>
+      <w:r>
+        <w:rPr>
+          <w:b/>
+          <w:color w:val="0070C0"/>
+          <w:sz w:val="28"/>
+        </w:rPr>
         <w:sym w:font="Wingdings" w:char="F0E0"/>
       </w:r>
       <w:r>
-        <w:t xml:space="preserve"> Descargar los datos de </w:t>
+        <w:rPr>
+          <w:sz w:val="28"/>
+        </w:rPr>
+        <w:t xml:space="preserve"> </w:t>
+      </w:r>
+      <w:r>
+        <w:rPr>
+          <w:b/>
+          <w:sz w:val="28"/>
+        </w:rPr>
+        <w:t>Descargar</w:t>
+      </w:r>
+      <w:r>
+        <w:rPr>
+          <w:sz w:val="28"/>
+        </w:rPr>
+        <w:t xml:space="preserve"> </w:t>
+      </w:r>
+      <w:r>
+        <w:t xml:space="preserve">los datos de </w:t>
       </w:r>
       <w:proofErr w:type="spellStart"/>
       <w:r>

</xml_diff>

<commit_message>
He añadido el archivo de repaso GItHUB x3
</commit_message>
<xml_diff>
--- a/Repaso GITHUB.docx
+++ b/Repaso GITHUB.docx
@@ -111,19 +111,42 @@
       </w:r>
       <w:proofErr w:type="spellStart"/>
       <w:r>
+        <w:rPr>
+          <w:b/>
+          <w:color w:val="0070C0"/>
+          <w:sz w:val="28"/>
+        </w:rPr>
         <w:t>Git</w:t>
       </w:r>
       <w:proofErr w:type="spellEnd"/>
       <w:r>
-        <w:t xml:space="preserve"> </w:t>
-      </w:r>
-      <w:proofErr w:type="spellStart"/>
-      <w:r>
+        <w:rPr>
+          <w:b/>
+          <w:color w:val="0070C0"/>
+          <w:sz w:val="28"/>
+        </w:rPr>
+        <w:t xml:space="preserve"> </w:t>
+      </w:r>
+      <w:proofErr w:type="spellStart"/>
+      <w:r>
+        <w:rPr>
+          <w:b/>
+          <w:color w:val="0070C0"/>
+          <w:sz w:val="28"/>
+        </w:rPr>
         <w:t>config</w:t>
       </w:r>
       <w:proofErr w:type="spellEnd"/>
       <w:r>
-        <w:t xml:space="preserve"> user.name “LUIS MIGUEL FUSTER”</w:t>
+        <w:rPr>
+          <w:b/>
+          <w:color w:val="0070C0"/>
+          <w:sz w:val="28"/>
+        </w:rPr>
+        <w:t xml:space="preserve"> user.name</w:t>
+      </w:r>
+      <w:r>
+        <w:t xml:space="preserve"> “LUIS MIGUEL FUSTER”</w:t>
       </w:r>
       <w:r>
         <w:tab/>
@@ -142,25 +165,64 @@
       </w:r>
       <w:proofErr w:type="spellStart"/>
       <w:r>
+        <w:rPr>
+          <w:b/>
+          <w:color w:val="0070C0"/>
+          <w:sz w:val="28"/>
+        </w:rPr>
         <w:t>Git</w:t>
       </w:r>
       <w:proofErr w:type="spellEnd"/>
       <w:r>
-        <w:t xml:space="preserve"> </w:t>
-      </w:r>
-      <w:proofErr w:type="spellStart"/>
-      <w:r>
+        <w:rPr>
+          <w:b/>
+          <w:color w:val="0070C0"/>
+          <w:sz w:val="28"/>
+        </w:rPr>
+        <w:t xml:space="preserve"> </w:t>
+      </w:r>
+      <w:proofErr w:type="spellStart"/>
+      <w:r>
+        <w:rPr>
+          <w:b/>
+          <w:color w:val="0070C0"/>
+          <w:sz w:val="28"/>
+        </w:rPr>
         <w:t>config</w:t>
       </w:r>
       <w:proofErr w:type="spellEnd"/>
       <w:r>
-        <w:t xml:space="preserve"> </w:t>
-      </w:r>
-      <w:r>
+        <w:rPr>
+          <w:b/>
+          <w:color w:val="0070C0"/>
+          <w:sz w:val="28"/>
+        </w:rPr>
+        <w:t xml:space="preserve"> </w:t>
+      </w:r>
+      <w:r>
+        <w:rPr>
+          <w:b/>
+          <w:color w:val="0070C0"/>
+          <w:sz w:val="28"/>
+        </w:rPr>
         <w:t>- -</w:t>
       </w:r>
       <w:r>
-        <w:t>global user.name “LUIS MIGUEL FUSTER”</w:t>
+        <w:rPr>
+          <w:b/>
+          <w:color w:val="0070C0"/>
+          <w:sz w:val="28"/>
+        </w:rPr>
+        <w:t>global user.name</w:t>
+      </w:r>
+      <w:r>
+        <w:rPr>
+          <w:sz w:val="28"/>
+        </w:rPr>
+        <w:t xml:space="preserve"> </w:t>
+      </w:r>
+      <w:r>
+        <w:t>“LUIS MIGUEL FUSTER”</w:t>
       </w:r>
       <w:r>
         <w:tab/>
@@ -181,27 +243,53 @@
       </w:r>
       <w:proofErr w:type="spellStart"/>
       <w:r>
+        <w:rPr>
+          <w:color w:val="0070C0"/>
+          <w:sz w:val="28"/>
+        </w:rPr>
         <w:t>Git</w:t>
       </w:r>
       <w:proofErr w:type="spellEnd"/>
       <w:r>
-        <w:t xml:space="preserve"> </w:t>
-      </w:r>
-      <w:proofErr w:type="spellStart"/>
-      <w:r>
+        <w:rPr>
+          <w:color w:val="0070C0"/>
+          <w:sz w:val="28"/>
+        </w:rPr>
+        <w:t xml:space="preserve"> </w:t>
+      </w:r>
+      <w:proofErr w:type="spellStart"/>
+      <w:r>
+        <w:rPr>
+          <w:color w:val="0070C0"/>
+          <w:sz w:val="28"/>
+        </w:rPr>
         <w:t>config</w:t>
       </w:r>
       <w:proofErr w:type="spellEnd"/>
       <w:r>
-        <w:t xml:space="preserve"> </w:t>
-      </w:r>
-      <w:proofErr w:type="spellStart"/>
-      <w:r>
+        <w:rPr>
+          <w:color w:val="0070C0"/>
+          <w:sz w:val="28"/>
+        </w:rPr>
+        <w:t xml:space="preserve"> </w:t>
+      </w:r>
+      <w:proofErr w:type="spellStart"/>
+      <w:r>
+        <w:rPr>
+          <w:color w:val="0070C0"/>
+          <w:sz w:val="28"/>
+        </w:rPr>
         <w:t>user.mail</w:t>
       </w:r>
       <w:proofErr w:type="spellEnd"/>
       <w:r>
-        <w:t xml:space="preserve"> “</w:t>
+        <w:rPr>
+          <w:sz w:val="28"/>
+        </w:rPr>
+        <w:t xml:space="preserve"> </w:t>
+      </w:r>
+      <w:r>
+        <w:t>“</w:t>
       </w:r>
       <w:hyperlink r:id="rId4" w:history="1">
         <w:r>
@@ -231,33 +319,74 @@
       </w:r>
       <w:proofErr w:type="spellStart"/>
       <w:r>
+        <w:rPr>
+          <w:b/>
+          <w:color w:val="0070C0"/>
+          <w:sz w:val="28"/>
+        </w:rPr>
         <w:t>Git</w:t>
       </w:r>
       <w:proofErr w:type="spellEnd"/>
       <w:r>
-        <w:t xml:space="preserve"> </w:t>
-      </w:r>
-      <w:proofErr w:type="spellStart"/>
-      <w:r>
+        <w:rPr>
+          <w:b/>
+          <w:color w:val="0070C0"/>
+          <w:sz w:val="28"/>
+        </w:rPr>
+        <w:t xml:space="preserve"> </w:t>
+      </w:r>
+      <w:proofErr w:type="spellStart"/>
+      <w:r>
+        <w:rPr>
+          <w:b/>
+          <w:color w:val="0070C0"/>
+          <w:sz w:val="28"/>
+        </w:rPr>
         <w:t>config</w:t>
       </w:r>
       <w:proofErr w:type="spellEnd"/>
       <w:r>
-        <w:t xml:space="preserve"> </w:t>
-      </w:r>
-      <w:r>
+        <w:rPr>
+          <w:b/>
+          <w:color w:val="0070C0"/>
+          <w:sz w:val="28"/>
+        </w:rPr>
+        <w:t xml:space="preserve"> </w:t>
+      </w:r>
+      <w:r>
+        <w:rPr>
+          <w:b/>
+          <w:color w:val="0070C0"/>
+          <w:sz w:val="28"/>
+        </w:rPr>
         <w:t>- -</w:t>
       </w:r>
       <w:r>
+        <w:rPr>
+          <w:b/>
+          <w:color w:val="0070C0"/>
+          <w:sz w:val="28"/>
+        </w:rPr>
         <w:t xml:space="preserve">global </w:t>
       </w:r>
       <w:proofErr w:type="spellStart"/>
       <w:r>
+        <w:rPr>
+          <w:b/>
+          <w:color w:val="0070C0"/>
+          <w:sz w:val="28"/>
+        </w:rPr>
         <w:t>user.mail</w:t>
       </w:r>
       <w:proofErr w:type="spellEnd"/>
       <w:r>
-        <w:t xml:space="preserve"> “</w:t>
+        <w:rPr>
+          <w:sz w:val="28"/>
+        </w:rPr>
+        <w:t xml:space="preserve"> </w:t>
+      </w:r>
+      <w:r>
+        <w:t>“</w:t>
       </w:r>
       <w:hyperlink r:id="rId5" w:history="1">
         <w:r>
@@ -1031,8 +1160,7 @@
       <w:r>
         <w:rPr>
           <w:b/>
-          <w:color w:val="0070C0"/>
-          <w:sz w:val="28"/>
+          <w:sz w:val="24"/>
         </w:rPr>
         <w:t>origin</w:t>
       </w:r>
@@ -1040,17 +1168,15 @@
       <w:r>
         <w:rPr>
           <w:b/>
-          <w:color w:val="0070C0"/>
-          <w:sz w:val="28"/>
-        </w:rPr>
-        <w:t xml:space="preserve">  “URL del </w:t>
-      </w:r>
-      <w:proofErr w:type="spellStart"/>
-      <w:r>
-        <w:rPr>
-          <w:b/>
-          <w:color w:val="0070C0"/>
-          <w:sz w:val="28"/>
+          <w:sz w:val="24"/>
+        </w:rPr>
+        <w:t xml:space="preserve">  URL del </w:t>
+      </w:r>
+      <w:proofErr w:type="spellStart"/>
+      <w:r>
+        <w:rPr>
+          <w:b/>
+          <w:sz w:val="24"/>
         </w:rPr>
         <w:t>github</w:t>
       </w:r>
@@ -1058,10 +1184,17 @@
       <w:r>
         <w:rPr>
           <w:b/>
-          <w:color w:val="0070C0"/>
-          <w:sz w:val="28"/>
-        </w:rPr>
-        <w:t xml:space="preserve"> propio” </w:t>
+          <w:sz w:val="24"/>
+        </w:rPr>
+        <w:t xml:space="preserve"> propio</w:t>
+      </w:r>
+      <w:r>
+        <w:rPr>
+          <w:b/>
+          <w:color w:val="0070C0"/>
+          <w:sz w:val="24"/>
+        </w:rPr>
+        <w:t xml:space="preserve"> </w:t>
       </w:r>
       <w:r>
         <w:rPr>
@@ -1147,6 +1280,112 @@
           <w:color w:val="0070C0"/>
           <w:sz w:val="28"/>
         </w:rPr>
+        <w:t>branch</w:t>
+      </w:r>
+      <w:proofErr w:type="spellEnd"/>
+      <w:r>
+        <w:rPr>
+          <w:b/>
+          <w:color w:val="0070C0"/>
+          <w:sz w:val="28"/>
+        </w:rPr>
+        <w:t xml:space="preserve"> –M </w:t>
+      </w:r>
+      <w:proofErr w:type="spellStart"/>
+      <w:r>
+        <w:rPr>
+          <w:b/>
+          <w:color w:val="000000" w:themeColor="text1"/>
+          <w:sz w:val="24"/>
+        </w:rPr>
+        <w:t>main</w:t>
+      </w:r>
+      <w:proofErr w:type="spellEnd"/>
+      <w:r>
+        <w:rPr>
+          <w:b/>
+          <w:color w:val="000000" w:themeColor="text1"/>
+          <w:sz w:val="24"/>
+        </w:rPr>
+        <w:t xml:space="preserve"> </w:t>
+      </w:r>
+      <w:r>
+        <w:rPr>
+          <w:b/>
+          <w:color w:val="0070C0"/>
+          <w:sz w:val="28"/>
+        </w:rPr>
+        <w:sym w:font="Wingdings" w:char="F0E0"/>
+      </w:r>
+      <w:r>
+        <w:rPr>
+          <w:b/>
+          <w:color w:val="0070C0"/>
+          <w:sz w:val="28"/>
+        </w:rPr>
+        <w:t xml:space="preserve"> </w:t>
+      </w:r>
+      <w:r>
+        <w:rPr>
+          <w:b/>
+          <w:sz w:val="28"/>
+        </w:rPr>
+        <w:t>Cambiar el nombre de la rama</w:t>
+      </w:r>
+      <w:r>
+        <w:t xml:space="preserve">, antes se llamaba </w:t>
+      </w:r>
+      <w:proofErr w:type="spellStart"/>
+      <w:r>
+        <w:t>Master</w:t>
+      </w:r>
+      <w:proofErr w:type="spellEnd"/>
+      <w:r>
+        <w:t xml:space="preserve"> ahora el nombre tiende a ser </w:t>
+      </w:r>
+      <w:proofErr w:type="spellStart"/>
+      <w:r>
+        <w:t>main</w:t>
+      </w:r>
+      <w:proofErr w:type="spellEnd"/>
+      <w:r>
+        <w:t>.</w:t>
+      </w:r>
+    </w:p>
+    <w:p>
+      <w:pPr>
+        <w:pStyle w:val="Sinespaciado"/>
+      </w:pPr>
+    </w:p>
+    <w:p>
+      <w:pPr>
+        <w:pStyle w:val="Sinespaciado"/>
+      </w:pPr>
+      <w:proofErr w:type="spellStart"/>
+      <w:r>
+        <w:rPr>
+          <w:b/>
+          <w:color w:val="0070C0"/>
+          <w:sz w:val="28"/>
+        </w:rPr>
+        <w:t>Git</w:t>
+      </w:r>
+      <w:proofErr w:type="spellEnd"/>
+      <w:r>
+        <w:rPr>
+          <w:b/>
+          <w:color w:val="0070C0"/>
+          <w:sz w:val="28"/>
+        </w:rPr>
+        <w:t xml:space="preserve"> </w:t>
+      </w:r>
+      <w:proofErr w:type="spellStart"/>
+      <w:r>
+        <w:rPr>
+          <w:b/>
+          <w:color w:val="0070C0"/>
+          <w:sz w:val="28"/>
+        </w:rPr>
         <w:t>push</w:t>
       </w:r>
       <w:proofErr w:type="spellEnd"/>
@@ -1162,8 +1401,8 @@
       <w:r>
         <w:rPr>
           <w:b/>
-          <w:color w:val="0070C0"/>
-          <w:sz w:val="28"/>
+          <w:color w:val="000000" w:themeColor="text1"/>
+          <w:sz w:val="24"/>
         </w:rPr>
         <w:t>origin</w:t>
       </w:r>
@@ -1171,17 +1410,17 @@
       <w:r>
         <w:rPr>
           <w:b/>
-          <w:color w:val="0070C0"/>
-          <w:sz w:val="28"/>
-        </w:rPr>
-        <w:t xml:space="preserve"> </w:t>
-      </w:r>
-      <w:proofErr w:type="spellStart"/>
-      <w:r>
-        <w:rPr>
-          <w:b/>
-          <w:color w:val="0070C0"/>
-          <w:sz w:val="28"/>
+          <w:color w:val="000000" w:themeColor="text1"/>
+          <w:sz w:val="24"/>
+        </w:rPr>
+        <w:t xml:space="preserve"> </w:t>
+      </w:r>
+      <w:proofErr w:type="spellStart"/>
+      <w:r>
+        <w:rPr>
+          <w:b/>
+          <w:color w:val="000000" w:themeColor="text1"/>
+          <w:sz w:val="24"/>
         </w:rPr>
         <w:t>main</w:t>
       </w:r>
@@ -1190,7 +1429,7 @@
         <w:rPr>
           <w:b/>
           <w:color w:val="0070C0"/>
-          <w:sz w:val="28"/>
+          <w:sz w:val="24"/>
         </w:rPr>
         <w:t xml:space="preserve"> </w:t>
       </w:r>
@@ -1285,8 +1524,8 @@
       <w:r>
         <w:rPr>
           <w:b/>
-          <w:color w:val="0070C0"/>
-          <w:sz w:val="28"/>
+          <w:color w:val="000000" w:themeColor="text1"/>
+          <w:sz w:val="24"/>
         </w:rPr>
         <w:t>origin</w:t>
       </w:r>
@@ -1294,17 +1533,17 @@
       <w:r>
         <w:rPr>
           <w:b/>
-          <w:color w:val="0070C0"/>
-          <w:sz w:val="28"/>
-        </w:rPr>
-        <w:t xml:space="preserve"> </w:t>
-      </w:r>
-      <w:proofErr w:type="spellStart"/>
-      <w:r>
-        <w:rPr>
-          <w:b/>
-          <w:color w:val="0070C0"/>
-          <w:sz w:val="28"/>
+          <w:color w:val="000000" w:themeColor="text1"/>
+          <w:sz w:val="24"/>
+        </w:rPr>
+        <w:t xml:space="preserve"> </w:t>
+      </w:r>
+      <w:proofErr w:type="spellStart"/>
+      <w:r>
+        <w:rPr>
+          <w:b/>
+          <w:color w:val="000000" w:themeColor="text1"/>
+          <w:sz w:val="24"/>
         </w:rPr>
         <w:t>main</w:t>
       </w:r>
@@ -1313,7 +1552,7 @@
         <w:rPr>
           <w:b/>
           <w:color w:val="0070C0"/>
-          <w:sz w:val="28"/>
+          <w:sz w:val="24"/>
         </w:rPr>
         <w:t xml:space="preserve"> </w:t>
       </w:r>
@@ -1363,6 +1602,303 @@
       <w:r>
         <w:t xml:space="preserve"> local.</w:t>
       </w:r>
+    </w:p>
+    <w:p>
+      <w:pPr>
+        <w:pStyle w:val="Sinespaciado"/>
+      </w:pPr>
+      <w:r>
+        <w:tab/>
+      </w:r>
+      <w:r>
+        <w:tab/>
+      </w:r>
+      <w:proofErr w:type="spellStart"/>
+      <w:r>
+        <w:rPr>
+          <w:b/>
+          <w:color w:val="0070C0"/>
+          <w:sz w:val="28"/>
+        </w:rPr>
+        <w:t>Git</w:t>
+      </w:r>
+      <w:proofErr w:type="spellEnd"/>
+      <w:r>
+        <w:rPr>
+          <w:b/>
+          <w:color w:val="0070C0"/>
+          <w:sz w:val="28"/>
+        </w:rPr>
+        <w:t xml:space="preserve"> </w:t>
+      </w:r>
+      <w:proofErr w:type="spellStart"/>
+      <w:r>
+        <w:rPr>
+          <w:b/>
+          <w:color w:val="0070C0"/>
+          <w:sz w:val="28"/>
+        </w:rPr>
+        <w:t>fetch</w:t>
+      </w:r>
+      <w:proofErr w:type="spellEnd"/>
+      <w:r>
+        <w:rPr>
+          <w:b/>
+          <w:color w:val="0070C0"/>
+          <w:sz w:val="28"/>
+        </w:rPr>
+        <w:t xml:space="preserve"> </w:t>
+      </w:r>
+      <w:proofErr w:type="spellStart"/>
+      <w:r>
+        <w:rPr>
+          <w:b/>
+          <w:sz w:val="24"/>
+        </w:rPr>
+        <w:t>orig</w:t>
+      </w:r>
+      <w:r>
+        <w:rPr>
+          <w:b/>
+          <w:sz w:val="24"/>
+        </w:rPr>
+        <w:t>in</w:t>
+      </w:r>
+      <w:proofErr w:type="spellEnd"/>
+      <w:r>
+        <w:rPr>
+          <w:b/>
+          <w:sz w:val="24"/>
+        </w:rPr>
+        <w:t xml:space="preserve"> </w:t>
+      </w:r>
+      <w:proofErr w:type="spellStart"/>
+      <w:r>
+        <w:rPr>
+          <w:b/>
+          <w:sz w:val="24"/>
+        </w:rPr>
+        <w:t>main</w:t>
+      </w:r>
+      <w:proofErr w:type="spellEnd"/>
+      <w:r>
+        <w:rPr>
+          <w:b/>
+          <w:color w:val="0070C0"/>
+          <w:sz w:val="24"/>
+        </w:rPr>
+        <w:t xml:space="preserve"> </w:t>
+      </w:r>
+      <w:r>
+        <w:rPr>
+          <w:b/>
+          <w:color w:val="0070C0"/>
+          <w:sz w:val="28"/>
+        </w:rPr>
+        <w:sym w:font="Wingdings" w:char="F0E0"/>
+      </w:r>
+      <w:r>
+        <w:rPr>
+          <w:sz w:val="28"/>
+        </w:rPr>
+        <w:t xml:space="preserve"> </w:t>
+      </w:r>
+      <w:r>
+        <w:t xml:space="preserve">Descarga los cambios </w:t>
+      </w:r>
+      <w:proofErr w:type="spellStart"/>
+      <w:r>
+        <w:t>mas</w:t>
+      </w:r>
+      <w:proofErr w:type="spellEnd"/>
+      <w:r>
+        <w:t xml:space="preserve"> recientes de la rama </w:t>
+      </w:r>
+      <w:proofErr w:type="spellStart"/>
+      <w:r>
+        <w:t>main</w:t>
+      </w:r>
+      <w:proofErr w:type="spellEnd"/>
+      <w:r>
+        <w:t xml:space="preserve"> </w:t>
+      </w:r>
+    </w:p>
+    <w:p>
+      <w:pPr>
+        <w:pStyle w:val="Sinespaciado"/>
+      </w:pPr>
+      <w:r>
+        <w:tab/>
+      </w:r>
+      <w:r>
+        <w:tab/>
+      </w:r>
+      <w:proofErr w:type="spellStart"/>
+      <w:r>
+        <w:rPr>
+          <w:b/>
+          <w:color w:val="0070C0"/>
+          <w:sz w:val="28"/>
+        </w:rPr>
+        <w:t>Git</w:t>
+      </w:r>
+      <w:proofErr w:type="spellEnd"/>
+      <w:r>
+        <w:rPr>
+          <w:b/>
+          <w:color w:val="0070C0"/>
+          <w:sz w:val="28"/>
+        </w:rPr>
+        <w:t xml:space="preserve"> </w:t>
+      </w:r>
+      <w:proofErr w:type="spellStart"/>
+      <w:r>
+        <w:rPr>
+          <w:b/>
+          <w:color w:val="0070C0"/>
+          <w:sz w:val="28"/>
+        </w:rPr>
+        <w:t>merge</w:t>
+      </w:r>
+      <w:proofErr w:type="spellEnd"/>
+      <w:r>
+        <w:rPr>
+          <w:b/>
+          <w:color w:val="0070C0"/>
+          <w:sz w:val="28"/>
+        </w:rPr>
+        <w:t xml:space="preserve"> </w:t>
+      </w:r>
+      <w:proofErr w:type="spellStart"/>
+      <w:r>
+        <w:rPr>
+          <w:b/>
+          <w:sz w:val="24"/>
+        </w:rPr>
+        <w:t>origin</w:t>
+      </w:r>
+      <w:proofErr w:type="spellEnd"/>
+      <w:r>
+        <w:rPr>
+          <w:b/>
+          <w:sz w:val="24"/>
+        </w:rPr>
+        <w:t xml:space="preserve"> </w:t>
+      </w:r>
+      <w:proofErr w:type="spellStart"/>
+      <w:r>
+        <w:rPr>
+          <w:b/>
+          <w:sz w:val="24"/>
+        </w:rPr>
+        <w:t>main</w:t>
+      </w:r>
+      <w:proofErr w:type="spellEnd"/>
+      <w:r>
+        <w:rPr>
+          <w:b/>
+          <w:color w:val="0070C0"/>
+          <w:sz w:val="24"/>
+        </w:rPr>
+        <w:t xml:space="preserve"> </w:t>
+      </w:r>
+      <w:r>
+        <w:rPr>
+          <w:b/>
+          <w:color w:val="0070C0"/>
+          <w:sz w:val="28"/>
+        </w:rPr>
+        <w:sym w:font="Wingdings" w:char="F0E0"/>
+      </w:r>
+      <w:r>
+        <w:rPr>
+          <w:b/>
+          <w:color w:val="0070C0"/>
+          <w:sz w:val="28"/>
+        </w:rPr>
+        <w:t xml:space="preserve"> </w:t>
+      </w:r>
+      <w:r>
+        <w:t xml:space="preserve">Fusiona los cambios en la rama local </w:t>
+      </w:r>
+      <w:proofErr w:type="spellStart"/>
+      <w:r>
+        <w:t>main</w:t>
+      </w:r>
+      <w:proofErr w:type="spellEnd"/>
+      <w:r>
+        <w:t>.</w:t>
+      </w:r>
+    </w:p>
+    <w:p>
+      <w:pPr>
+        <w:pStyle w:val="Sinespaciado"/>
+        <w:rPr>
+          <w:b/>
+          <w:sz w:val="28"/>
+        </w:rPr>
+      </w:pPr>
+      <w:r>
+        <w:tab/>
+      </w:r>
+      <w:proofErr w:type="spellStart"/>
+      <w:r>
+        <w:rPr>
+          <w:b/>
+          <w:sz w:val="28"/>
+        </w:rPr>
+        <w:t>Pull</w:t>
+      </w:r>
+      <w:proofErr w:type="spellEnd"/>
+      <w:r>
+        <w:rPr>
+          <w:b/>
+          <w:sz w:val="28"/>
+        </w:rPr>
+        <w:t xml:space="preserve"> = </w:t>
+      </w:r>
+      <w:proofErr w:type="spellStart"/>
+      <w:r>
+        <w:rPr>
+          <w:b/>
+          <w:sz w:val="28"/>
+        </w:rPr>
+        <w:t>fetch</w:t>
+      </w:r>
+      <w:proofErr w:type="spellEnd"/>
+      <w:r>
+        <w:rPr>
+          <w:b/>
+          <w:sz w:val="28"/>
+        </w:rPr>
+        <w:t xml:space="preserve"> + </w:t>
+      </w:r>
+      <w:proofErr w:type="spellStart"/>
+      <w:r>
+        <w:rPr>
+          <w:b/>
+          <w:sz w:val="28"/>
+        </w:rPr>
+        <w:t>merge</w:t>
+      </w:r>
+      <w:proofErr w:type="spellEnd"/>
+    </w:p>
+    <w:p>
+      <w:pPr>
+        <w:pStyle w:val="Sinespaciado"/>
+        <w:rPr>
+          <w:b/>
+          <w:sz w:val="28"/>
+        </w:rPr>
+      </w:pPr>
+    </w:p>
+    <w:p>
+      <w:pPr>
+        <w:pStyle w:val="Sinespaciado"/>
+        <w:rPr>
+          <w:b/>
+        </w:rPr>
+      </w:pPr>
     </w:p>
     <w:sectPr>
       <w:pgSz w:w="11906" w:h="16838"/>

</xml_diff>

<commit_message>
FIn de la creacion del archivo de ayuda de git-github
</commit_message>
<xml_diff>
--- a/Repaso GITHUB.docx
+++ b/Repaso GITHUB.docx
@@ -1356,11 +1356,6 @@
       <w:pPr>
         <w:pStyle w:val="Sinespaciado"/>
       </w:pPr>
-    </w:p>
-    <w:p>
-      <w:pPr>
-        <w:pStyle w:val="Sinespaciado"/>
-      </w:pPr>
       <w:proofErr w:type="spellStart"/>
       <w:r>
         <w:rPr>
@@ -1386,6 +1381,92 @@
           <w:color w:val="0070C0"/>
           <w:sz w:val="28"/>
         </w:rPr>
+        <w:t>branch</w:t>
+      </w:r>
+      <w:proofErr w:type="spellEnd"/>
+      <w:r>
+        <w:rPr>
+          <w:b/>
+          <w:color w:val="0070C0"/>
+          <w:sz w:val="28"/>
+        </w:rPr>
+        <w:t xml:space="preserve"> –</w:t>
+      </w:r>
+      <w:r>
+        <w:rPr>
+          <w:b/>
+          <w:color w:val="0070C0"/>
+          <w:sz w:val="28"/>
+        </w:rPr>
+        <w:t>a</w:t>
+      </w:r>
+      <w:r>
+        <w:rPr>
+          <w:b/>
+          <w:color w:val="0070C0"/>
+          <w:sz w:val="28"/>
+        </w:rPr>
+        <w:t xml:space="preserve"> </w:t>
+      </w:r>
+      <w:r>
+        <w:rPr>
+          <w:b/>
+          <w:color w:val="0070C0"/>
+          <w:sz w:val="28"/>
+        </w:rPr>
+        <w:sym w:font="Wingdings" w:char="F0E0"/>
+      </w:r>
+      <w:r>
+        <w:rPr>
+          <w:b/>
+          <w:color w:val="0070C0"/>
+          <w:sz w:val="28"/>
+        </w:rPr>
+        <w:t xml:space="preserve"> </w:t>
+      </w:r>
+      <w:r>
+        <w:t>Ver todas las ramas del proyecto.</w:t>
+      </w:r>
+    </w:p>
+    <w:p>
+      <w:pPr>
+        <w:pStyle w:val="Sinespaciado"/>
+      </w:pPr>
+    </w:p>
+    <w:p>
+      <w:pPr>
+        <w:pStyle w:val="Sinespaciado"/>
+      </w:pPr>
+    </w:p>
+    <w:p>
+      <w:pPr>
+        <w:pStyle w:val="Sinespaciado"/>
+      </w:pPr>
+      <w:proofErr w:type="spellStart"/>
+      <w:r>
+        <w:rPr>
+          <w:b/>
+          <w:color w:val="0070C0"/>
+          <w:sz w:val="28"/>
+        </w:rPr>
+        <w:t>Git</w:t>
+      </w:r>
+      <w:proofErr w:type="spellEnd"/>
+      <w:r>
+        <w:rPr>
+          <w:b/>
+          <w:color w:val="0070C0"/>
+          <w:sz w:val="28"/>
+        </w:rPr>
+        <w:t xml:space="preserve"> </w:t>
+      </w:r>
+      <w:proofErr w:type="spellStart"/>
+      <w:r>
+        <w:rPr>
+          <w:b/>
+          <w:color w:val="0070C0"/>
+          <w:sz w:val="28"/>
+        </w:rPr>
         <w:t>push</w:t>
       </w:r>
       <w:proofErr w:type="spellEnd"/>
@@ -1897,8 +1978,342 @@
         <w:pStyle w:val="Sinespaciado"/>
         <w:rPr>
           <w:b/>
-        </w:rPr>
-      </w:pPr>
+          <w:color w:val="0070C0"/>
+          <w:sz w:val="28"/>
+        </w:rPr>
+      </w:pPr>
+      <w:proofErr w:type="spellStart"/>
+      <w:r>
+        <w:rPr>
+          <w:b/>
+          <w:color w:val="0070C0"/>
+          <w:sz w:val="28"/>
+        </w:rPr>
+        <w:t>Git</w:t>
+      </w:r>
+      <w:proofErr w:type="spellEnd"/>
+      <w:r>
+        <w:rPr>
+          <w:b/>
+          <w:color w:val="0070C0"/>
+          <w:sz w:val="28"/>
+        </w:rPr>
+        <w:t xml:space="preserve"> </w:t>
+      </w:r>
+      <w:proofErr w:type="spellStart"/>
+      <w:r>
+        <w:rPr>
+          <w:b/>
+          <w:color w:val="0070C0"/>
+          <w:sz w:val="28"/>
+        </w:rPr>
+        <w:t>checkout</w:t>
+      </w:r>
+      <w:proofErr w:type="spellEnd"/>
+      <w:r>
+        <w:rPr>
+          <w:b/>
+          <w:color w:val="0070C0"/>
+          <w:sz w:val="28"/>
+        </w:rPr>
+        <w:t xml:space="preserve"> </w:t>
+      </w:r>
+    </w:p>
+    <w:p>
+      <w:pPr>
+        <w:pStyle w:val="Sinespaciado"/>
+      </w:pPr>
+      <w:r>
+        <w:tab/>
+      </w:r>
+      <w:proofErr w:type="spellStart"/>
+      <w:r>
+        <w:rPr>
+          <w:b/>
+          <w:color w:val="0070C0"/>
+          <w:sz w:val="28"/>
+        </w:rPr>
+        <w:t>Git</w:t>
+      </w:r>
+      <w:proofErr w:type="spellEnd"/>
+      <w:r>
+        <w:rPr>
+          <w:b/>
+          <w:color w:val="0070C0"/>
+          <w:sz w:val="28"/>
+        </w:rPr>
+        <w:t xml:space="preserve"> </w:t>
+      </w:r>
+      <w:proofErr w:type="spellStart"/>
+      <w:r>
+        <w:rPr>
+          <w:b/>
+          <w:color w:val="0070C0"/>
+          <w:sz w:val="28"/>
+        </w:rPr>
+        <w:t>checkout</w:t>
+      </w:r>
+      <w:proofErr w:type="spellEnd"/>
+      <w:r>
+        <w:rPr>
+          <w:b/>
+          <w:color w:val="0070C0"/>
+          <w:sz w:val="28"/>
+        </w:rPr>
+        <w:t xml:space="preserve"> </w:t>
+      </w:r>
+      <w:r>
+        <w:rPr>
+          <w:b/>
+          <w:sz w:val="24"/>
+        </w:rPr>
+        <w:t xml:space="preserve">rama </w:t>
+      </w:r>
+      <w:r>
+        <w:rPr>
+          <w:b/>
+          <w:color w:val="0070C0"/>
+          <w:sz w:val="28"/>
+        </w:rPr>
+        <w:sym w:font="Wingdings" w:char="F0E0"/>
+      </w:r>
+      <w:r>
+        <w:rPr>
+          <w:sz w:val="28"/>
+        </w:rPr>
+        <w:t xml:space="preserve"> </w:t>
+      </w:r>
+      <w:r>
+        <w:t>cambia de rama</w:t>
+      </w:r>
+    </w:p>
+    <w:p>
+      <w:pPr>
+        <w:pStyle w:val="Sinespaciado"/>
+      </w:pPr>
+      <w:r>
+        <w:tab/>
+      </w:r>
+      <w:proofErr w:type="spellStart"/>
+      <w:r>
+        <w:rPr>
+          <w:b/>
+          <w:color w:val="0070C0"/>
+          <w:sz w:val="28"/>
+        </w:rPr>
+        <w:t>Git</w:t>
+      </w:r>
+      <w:proofErr w:type="spellEnd"/>
+      <w:r>
+        <w:rPr>
+          <w:b/>
+          <w:color w:val="0070C0"/>
+          <w:sz w:val="28"/>
+        </w:rPr>
+        <w:t xml:space="preserve"> </w:t>
+      </w:r>
+      <w:proofErr w:type="spellStart"/>
+      <w:r>
+        <w:rPr>
+          <w:b/>
+          <w:color w:val="0070C0"/>
+          <w:sz w:val="28"/>
+        </w:rPr>
+        <w:t>checkout</w:t>
+      </w:r>
+      <w:proofErr w:type="spellEnd"/>
+      <w:r>
+        <w:rPr>
+          <w:b/>
+          <w:color w:val="0070C0"/>
+          <w:sz w:val="28"/>
+        </w:rPr>
+        <w:t xml:space="preserve"> .b </w:t>
+      </w:r>
+      <w:proofErr w:type="spellStart"/>
+      <w:r>
+        <w:rPr>
+          <w:b/>
+          <w:sz w:val="24"/>
+        </w:rPr>
+        <w:t>nueva_rama</w:t>
+      </w:r>
+      <w:proofErr w:type="spellEnd"/>
+      <w:r>
+        <w:rPr>
+          <w:b/>
+          <w:color w:val="0070C0"/>
+          <w:sz w:val="28"/>
+        </w:rPr>
+        <w:t xml:space="preserve"> </w:t>
+      </w:r>
+      <w:r>
+        <w:rPr>
+          <w:b/>
+          <w:color w:val="0070C0"/>
+          <w:sz w:val="28"/>
+        </w:rPr>
+        <w:sym w:font="Wingdings" w:char="F0E0"/>
+      </w:r>
+      <w:r>
+        <w:rPr>
+          <w:sz w:val="28"/>
+        </w:rPr>
+        <w:t xml:space="preserve"> </w:t>
+      </w:r>
+      <w:r>
+        <w:t>crea una rama nueva y empiezas a trabajar en ella.</w:t>
+      </w:r>
+    </w:p>
+    <w:p>
+      <w:pPr>
+        <w:pStyle w:val="Sinespaciado"/>
+      </w:pPr>
+      <w:r>
+        <w:tab/>
+      </w:r>
+      <w:proofErr w:type="spellStart"/>
+      <w:r>
+        <w:rPr>
+          <w:b/>
+          <w:color w:val="0070C0"/>
+          <w:sz w:val="28"/>
+        </w:rPr>
+        <w:t>Git</w:t>
+      </w:r>
+      <w:proofErr w:type="spellEnd"/>
+      <w:r>
+        <w:rPr>
+          <w:b/>
+          <w:color w:val="0070C0"/>
+          <w:sz w:val="28"/>
+        </w:rPr>
+        <w:t xml:space="preserve"> </w:t>
+      </w:r>
+      <w:proofErr w:type="spellStart"/>
+      <w:r>
+        <w:rPr>
+          <w:b/>
+          <w:color w:val="0070C0"/>
+          <w:sz w:val="28"/>
+        </w:rPr>
+        <w:t>checkout</w:t>
+      </w:r>
+      <w:proofErr w:type="spellEnd"/>
+      <w:r>
+        <w:rPr>
+          <w:b/>
+          <w:color w:val="0070C0"/>
+          <w:sz w:val="28"/>
+        </w:rPr>
+        <w:t xml:space="preserve"> </w:t>
+      </w:r>
+      <w:r>
+        <w:rPr>
+          <w:b/>
+          <w:sz w:val="24"/>
+        </w:rPr>
+        <w:t xml:space="preserve">rama - -archivo </w:t>
+      </w:r>
+      <w:r>
+        <w:rPr>
+          <w:b/>
+          <w:color w:val="0070C0"/>
+          <w:sz w:val="28"/>
+        </w:rPr>
+        <w:sym w:font="Wingdings" w:char="F0E0"/>
+      </w:r>
+      <w:r>
+        <w:rPr>
+          <w:sz w:val="28"/>
+        </w:rPr>
+        <w:t xml:space="preserve"> </w:t>
+      </w:r>
+      <w:r>
+        <w:t>recuperar el archivo desde otra rama.</w:t>
+      </w:r>
+    </w:p>
+    <w:p>
+      <w:pPr>
+        <w:pStyle w:val="Sinespaciado"/>
+      </w:pPr>
+    </w:p>
+    <w:p>
+      <w:pPr>
+        <w:pStyle w:val="Sinespaciado"/>
+      </w:pPr>
+      <w:proofErr w:type="spellStart"/>
+      <w:r>
+        <w:rPr>
+          <w:b/>
+          <w:color w:val="0070C0"/>
+          <w:sz w:val="28"/>
+        </w:rPr>
+        <w:t>Git</w:t>
+      </w:r>
+      <w:proofErr w:type="spellEnd"/>
+      <w:r>
+        <w:rPr>
+          <w:b/>
+          <w:color w:val="0070C0"/>
+          <w:sz w:val="28"/>
+        </w:rPr>
+        <w:t xml:space="preserve"> rebase </w:t>
+      </w:r>
+      <w:r>
+        <w:rPr>
+          <w:b/>
+          <w:sz w:val="24"/>
+        </w:rPr>
+        <w:t>rama</w:t>
+      </w:r>
+      <w:r>
+        <w:rPr>
+          <w:b/>
+          <w:color w:val="0070C0"/>
+          <w:sz w:val="24"/>
+        </w:rPr>
+        <w:t xml:space="preserve"> </w:t>
+      </w:r>
+      <w:r>
+        <w:rPr>
+          <w:b/>
+          <w:color w:val="0070C0"/>
+          <w:sz w:val="28"/>
+        </w:rPr>
+        <w:sym w:font="Wingdings" w:char="F0E0"/>
+      </w:r>
+      <w:r>
+        <w:rPr>
+          <w:sz w:val="28"/>
+        </w:rPr>
+        <w:t xml:space="preserve"> </w:t>
+      </w:r>
+      <w:r>
+        <w:rPr>
+          <w:b/>
+          <w:sz w:val="24"/>
+        </w:rPr>
+        <w:t xml:space="preserve">Reorganizar </w:t>
+      </w:r>
+      <w:proofErr w:type="spellStart"/>
+      <w:r>
+        <w:rPr>
+          <w:b/>
+          <w:sz w:val="24"/>
+        </w:rPr>
+        <w:t>commits</w:t>
+      </w:r>
+      <w:proofErr w:type="spellEnd"/>
+      <w:r>
+        <w:rPr>
+          <w:sz w:val="24"/>
+        </w:rPr>
+        <w:t xml:space="preserve"> </w:t>
+      </w:r>
+      <w:r>
+        <w:t>(rama es la rama donde va a ir limpio la rama en la que estamos)</w:t>
+      </w:r>
     </w:p>
     <w:sectPr>
       <w:pgSz w:w="11906" w:h="16838"/>

</xml_diff>